<commit_message>
Make biochar unit a sole proprietary concern of Arun T.; add Biochar Committee copy
- Reframe the KSPCB clarification letter from the partnership 'Arun and Friends'
  to a sole proprietary concern of Arun T. (first-person throughout; signatory
  'Arun T. — Proprietor'; ref prefix AT/).
- Add second copy recipient: 'The Convener, Kerala State Expert Committee on
  Biochar', alongside the KSPCB District Office, Palakkad.
- Rebuilt, OOXML-validated and render-verified (2 pages).

Co-authored-by: Arun T <mailarunthangavel@gmail.com>
</commit_message>
<xml_diff>
--- a/biochar/KSPCB-Category-Clarification-Biochar.docx
+++ b/biochar/KSPCB-Category-Clarification-Biochar.docx
@@ -16,7 +16,7 @@
           <w:sz w:val="28"/>
           <w:szCs w:val="28"/>
         </w:rPr>
-        <w:t xml:space="preserve">ARUN AND FRIENDS</w:t>
+        <w:t xml:space="preserve">ARUN T.</w:t>
       </w:r>
     </w:p>
     <w:p>
@@ -33,7 +33,7 @@
           <w:sz w:val="19"/>
           <w:szCs w:val="19"/>
         </w:rPr>
-        <w:t xml:space="preserve">(Proposed partnership enterprise — Tender-Coconut &amp; Agri-Biomass Biochar Unit)</w:t>
+        <w:t xml:space="preserve">(Sole proprietary concern — Tender-Coconut &amp; Agri-Biomass Biochar Unit)</w:t>
       </w:r>
     </w:p>
     <w:p>
@@ -108,7 +108,7 @@
           <w:sz w:val="22"/>
           <w:szCs w:val="22"/>
         </w:rPr>
-        <w:t xml:space="preserve">AAF/KSPCB/CAT/2026/[__]</w:t>
+        <w:t xml:space="preserve">AT/KSPCB/CAT/2026/[__]</w:t>
       </w:r>
       <w:r>
         <w:rPr>
@@ -210,7 +210,19 @@
           <w:sz w:val="22"/>
           <w:szCs w:val="22"/>
         </w:rPr>
-        <w:t xml:space="preserve">The Environmental Engineer, KSPCB District Office, Palakkad.</w:t>
+        <w:t xml:space="preserve">1. The Environmental Engineer, KSPCB District Office, Palakkad.</w:t>
+      </w:r>
+      <w:r>
+        <w:br/>
+      </w:r>
+      <w:r>
+        <w:rPr>
+          <w:rFonts w:ascii="Times New Roman" w:cs="Times New Roman" w:eastAsia="Times New Roman" w:hAnsi="Times New Roman"/>
+          <w:color w:val="1A1A1A"/>
+          <w:sz w:val="22"/>
+          <w:szCs w:val="22"/>
+        </w:rPr>
+        <w:t xml:space="preserve">2. The Convener, Kerala State Expert Committee on Biochar.</w:t>
       </w:r>
     </w:p>
     <w:p>
@@ -411,27 +423,27 @@
           <w:sz w:val="22"/>
           <w:szCs w:val="22"/>
         </w:rPr>
-        <w:t xml:space="preserve">We, </w:t>
-      </w:r>
-      <w:r>
-        <w:rPr>
-          <w:rFonts w:ascii="Times New Roman" w:cs="Times New Roman" w:eastAsia="Times New Roman" w:hAnsi="Times New Roman"/>
-          <w:b/>
-          <w:bCs/>
-          <w:color w:val="1A1A1A"/>
-          <w:sz w:val="22"/>
-          <w:szCs w:val="22"/>
-        </w:rPr>
-        <w:t xml:space="preserve">Arun and Friends</w:t>
-      </w:r>
-      <w:r>
-        <w:rPr>
-          <w:rFonts w:ascii="Times New Roman" w:cs="Times New Roman" w:eastAsia="Times New Roman" w:hAnsi="Times New Roman"/>
-          <w:color w:val="1A1A1A"/>
-          <w:sz w:val="22"/>
-          <w:szCs w:val="22"/>
-        </w:rPr>
-        <w:t xml:space="preserve"> (a proposed partnership enterprise), intend to establish a </w:t>
+        <w:t xml:space="preserve">I, </w:t>
+      </w:r>
+      <w:r>
+        <w:rPr>
+          <w:rFonts w:ascii="Times New Roman" w:cs="Times New Roman" w:eastAsia="Times New Roman" w:hAnsi="Times New Roman"/>
+          <w:b/>
+          <w:bCs/>
+          <w:color w:val="1A1A1A"/>
+          <w:sz w:val="22"/>
+          <w:szCs w:val="22"/>
+        </w:rPr>
+        <w:t xml:space="preserve">Arun T.</w:t>
+      </w:r>
+      <w:r>
+        <w:rPr>
+          <w:rFonts w:ascii="Times New Roman" w:cs="Times New Roman" w:eastAsia="Times New Roman" w:hAnsi="Times New Roman"/>
+          <w:color w:val="1A1A1A"/>
+          <w:sz w:val="22"/>
+          <w:szCs w:val="22"/>
+        </w:rPr>
+        <w:t xml:space="preserve">, proprietor of a proposed sole proprietary concern, intend to establish a </w:t>
       </w:r>
       <w:r>
         <w:rPr>
@@ -451,18 +463,18 @@
           <w:sz w:val="22"/>
           <w:szCs w:val="22"/>
         </w:rPr>
-        <w:t xml:space="preserve"> on an owned 38-cent plot at Eruthenpathy, Chittur Taluk (Block No. 30, Survey No. 300), Palakkad. Before filing our Consent to Establish, we respectfully seek a </w:t>
-      </w:r>
-      <w:r>
-        <w:rPr>
-          <w:rFonts w:ascii="Times New Roman" w:cs="Times New Roman" w:eastAsia="Times New Roman" w:hAnsi="Times New Roman"/>
-          <w:b/>
-          <w:bCs/>
-          <w:color w:val="1A1A1A"/>
-          <w:sz w:val="22"/>
-          <w:szCs w:val="22"/>
-        </w:rPr>
-        <w:t xml:space="preserve">written clarification on the sector entry and pollution-category applicable to our unit</w:t>
+        <w:t xml:space="preserve"> on my owned 38-cent plot at Eruthenpathy, Chittur Taluk (Block No. 30, Survey No. 300), Palakkad. Before filing my Consent to Establish, I respectfully seek a </w:t>
+      </w:r>
+      <w:r>
+        <w:rPr>
+          <w:rFonts w:ascii="Times New Roman" w:cs="Times New Roman" w:eastAsia="Times New Roman" w:hAnsi="Times New Roman"/>
+          <w:b/>
+          <w:bCs/>
+          <w:color w:val="1A1A1A"/>
+          <w:sz w:val="22"/>
+          <w:szCs w:val="22"/>
+        </w:rPr>
+        <w:t xml:space="preserve">written clarification on the sector entry and pollution-category applicable to the unit</w:t>
       </w:r>
       <w:r>
         <w:rPr>
@@ -719,7 +731,7 @@
           <w:sz w:val="22"/>
           <w:szCs w:val="22"/>
         </w:rPr>
-        <w:t xml:space="preserve">Our unit could be read against either of two entries. We request confirmation of which one applies:</w:t>
+        <w:t xml:space="preserve">The unit could be read against either of two entries. I request confirmation of which one applies:</w:t>
       </w:r>
     </w:p>
     <w:tbl>
@@ -942,7 +954,7 @@
                 <w:sz w:val="20"/>
                 <w:szCs w:val="20"/>
               </w:rPr>
-              <w:t xml:space="preserve">General charcoal / char (biochar) production — as we understand it is classified under the revised list as on 29.12.2025</w:t>
+              <w:t xml:space="preserve">General charcoal / char (biochar) production — as I understand it is classified under the revised list as on 29.12.2025</w:t>
             </w:r>
           </w:p>
         </w:tc>
@@ -1032,7 +1044,7 @@
           <w:sz w:val="23"/>
           <w:szCs w:val="23"/>
         </w:rPr>
-        <w:t xml:space="preserve">4.  Why we submit the general (lighter) entry is the correct fit</w:t>
+        <w:t xml:space="preserve">4.  Why I submit the general (lighter) entry is the correct fit</w:t>
       </w:r>
     </w:p>
     <w:p>
@@ -1062,7 +1074,7 @@
           <w:sz w:val="22"/>
           <w:szCs w:val="22"/>
         </w:rPr>
-        <w:t xml:space="preserve">Our feedstock is mixed agri-biomass, not a coconut-shell-only charge; the 10.08.2024 Orange entry is worded specifically for “coconut shell.”</w:t>
+        <w:t xml:space="preserve">The feedstock is mixed agri-biomass, not a coconut-shell-only charge; the 10.08.2024 Orange entry is worded specifically for “coconut shell.”</w:t>
       </w:r>
     </w:p>
     <w:p>
@@ -1183,7 +1195,7 @@
           <w:sz w:val="22"/>
           <w:szCs w:val="22"/>
         </w:rPr>
-        <w:t xml:space="preserve">We respectfully request the Board to clarify, in writing:</w:t>
+        <w:t xml:space="preserve">I respectfully request the Board to clarify, in writing:</w:t>
       </w:r>
     </w:p>
     <w:p>
@@ -1243,7 +1255,7 @@
           <w:sz w:val="22"/>
           <w:szCs w:val="22"/>
         </w:rPr>
-        <w:t xml:space="preserve">the consent conditions, and whether the unit is eligible for the self-certification route under the 16.09.2025 circular at our capital-investment level.</w:t>
+        <w:t xml:space="preserve">the consent conditions, and whether the unit is eligible for the self-certification route under the 16.09.2025 circular at my capital-investment level.</w:t>
       </w:r>
     </w:p>
     <w:p>
@@ -1273,7 +1285,7 @@
           <w:sz w:val="22"/>
           <w:szCs w:val="22"/>
         </w:rPr>
-        <w:t xml:space="preserve">(emission limits, minimum stack height, distance/siting criteria) under the 02.12.2025 charcoal guidelines that we must design to.</w:t>
+        <w:t xml:space="preserve">(emission limits, minimum stack height, distance/siting criteria) under the 02.12.2025 charcoal guidelines that I must design to.</w:t>
       </w:r>
     </w:p>
     <w:p>
@@ -1391,7 +1403,7 @@
           <w:sz w:val="22"/>
           <w:szCs w:val="22"/>
         </w:rPr>
-        <w:t xml:space="preserve">An early written clarification will let us file a correctly-categorised Consent to Establish and design the unit to the exact norms. We shall be glad to furnish any further particulars or meet the concerned officer at the District Office.</w:t>
+        <w:t xml:space="preserve">An early written clarification will let me file a correctly-categorised Consent to Establish and design the unit to the exact norms. I shall be glad to furnish any further particulars or meet the concerned officer at the District Office.</w:t>
       </w:r>
     </w:p>
     <w:p>
@@ -1458,7 +1470,7 @@
           <w:sz w:val="22"/>
           <w:szCs w:val="22"/>
         </w:rPr>
-        <w:t xml:space="preserve">  — for and on behalf of Arun and Friends (proposed)</w:t>
+        <w:t xml:space="preserve">  — Proprietor</w:t>
       </w:r>
     </w:p>
     <w:p>
@@ -1543,7 +1555,7 @@
         <w:sz w:val="16"/>
         <w:szCs w:val="16"/>
       </w:rPr>
-      <w:t xml:space="preserve">Arun and Friends — KSPCB category clarification (biochar unit, Chittur)</w:t>
+      <w:t xml:space="preserve">Arun T. — KSPCB category clarification (biochar unit, Chittur)</w:t>
     </w:r>
     <w:r>
       <w:rPr>

</xml_diff>